<commit_message>
Sync Drive para configs sigilosas, limpeza e melhorias de documentos/CAD.
- local_secrets_sync: push/pull de PII e .env via Google Drive Desktop
- INICIAR_SISTEMA e start_backend puxam configs do Drive no startup
- Modal de contrato, app settings, tokens unifilar CAD, parser TXT ampliado
- config_padrao.json sem PII do procurador; templates/antigo ignorado no git
</commit_message>
<xml_diff>
--- a/templates/ModeloContrato.docx
+++ b/templates/ModeloContrato.docx
@@ -45,7 +45,53 @@
           <w:rFonts w:ascii="Arial" w:eastAsia="Arial" w:hAnsi="Arial"/>
           <w:sz w:val="19"/>
         </w:rPr>
-        <w:t xml:space="preserve">(a). {{NOME_CLIENTE}}, doravante designado(a) CONTRATANTE, portador(a) do CPF nº {{CPF}}, RG nº {{RG_COMPLETO}}, residente e domiciliado em {{ENDERECO}}, Nº {{NUMERO}}{{COMPLEMENTO}}, Bairro: {{BAIRRO}}, Cidade/UF: {{CIDADE}}/{{UF}}.A PIENG SOLUÇÕES ENERGÉTICAS LTDA – PIENG -, com sede na cidade de Anápolis, Estado de Goiás, na Av. Vera Cruz, </w:t>
+        <w:t>(a). {{NOME_CLIENTE}}, doravante designado(a) CONTRATANTE, portador(a) do CPF nº {{CPF}}, RG nº {{RG_COMPLETO}}, residente e domiciliado em {{ENDERECO}}, Nº {{</w:t>
+      </w:r>
+      <w:proofErr w:type="gramStart"/>
+      <w:r>
+        <w:rPr>
+          <w:rFonts w:ascii="Arial" w:eastAsia="Arial" w:hAnsi="Arial"/>
+          <w:sz w:val="19"/>
+        </w:rPr>
+        <w:t>NUMERO}}{</w:t>
+      </w:r>
+      <w:proofErr w:type="gramEnd"/>
+      <w:r>
+        <w:rPr>
+          <w:rFonts w:ascii="Arial" w:eastAsia="Arial" w:hAnsi="Arial"/>
+          <w:sz w:val="19"/>
+        </w:rPr>
+        <w:t>{COMPLEMENTO}}, Bairro: {{BAIRRO}}, Cidade/UF: {{CIDADE</w:t>
+      </w:r>
+      <w:proofErr w:type="gramStart"/>
+      <w:r>
+        <w:rPr>
+          <w:rFonts w:ascii="Arial" w:eastAsia="Arial" w:hAnsi="Arial"/>
+          <w:sz w:val="19"/>
+        </w:rPr>
+        <w:t>}}/</w:t>
+      </w:r>
+      <w:proofErr w:type="gramEnd"/>
+      <w:r>
+        <w:rPr>
+          <w:rFonts w:ascii="Arial" w:eastAsia="Arial" w:hAnsi="Arial"/>
+          <w:sz w:val="19"/>
+        </w:rPr>
+        <w:t>{{UF}}.</w:t>
+      </w:r>
+      <w:r>
+        <w:rPr>
+          <w:rFonts w:ascii="Arial" w:eastAsia="Arial" w:hAnsi="Arial"/>
+          <w:sz w:val="19"/>
+        </w:rPr>
+        <w:t xml:space="preserve">  </w:t>
+      </w:r>
+      <w:r>
+        <w:rPr>
+          <w:rFonts w:ascii="Arial" w:eastAsia="Arial" w:hAnsi="Arial"/>
+          <w:sz w:val="19"/>
+        </w:rPr>
+        <w:t xml:space="preserve">A PIENG SOLUÇÕES ENERGÉTICAS LTDA – PIENG -, com sede na cidade de Anápolis, Estado de Goiás, na Av. Vera Cruz, </w:t>
       </w:r>
       <w:proofErr w:type="spellStart"/>
       <w:r>
@@ -1074,7 +1120,20 @@
           <w:rFonts w:ascii="Times New Roman" w:eastAsia="Times New Roman" w:hAnsi="Times New Roman" w:cs="Times New Roman"/>
         </w:rPr>
         <w:br/>
-        <w:t>Pix : 45.719.837/0001-23</w:t>
+      </w:r>
+      <w:proofErr w:type="gramStart"/>
+      <w:r>
+        <w:rPr>
+          <w:rFonts w:ascii="Times New Roman" w:eastAsia="Times New Roman" w:hAnsi="Times New Roman" w:cs="Times New Roman"/>
+        </w:rPr>
+        <w:t>Pix :</w:t>
+      </w:r>
+      <w:proofErr w:type="gramEnd"/>
+      <w:r>
+        <w:rPr>
+          <w:rFonts w:ascii="Times New Roman" w:eastAsia="Times New Roman" w:hAnsi="Times New Roman" w:cs="Times New Roman"/>
+        </w:rPr>
+        <w:t xml:space="preserve"> 45.719.837/0001-23</w:t>
       </w:r>
     </w:p>
     <w:p>
@@ -2098,7 +2157,25 @@
         <w:b/>
         <w:sz w:val="19"/>
       </w:rPr>
-      <w:t>{{NUMERO_CONTRATO}}</w:t>
+      <w:t>{{</w:t>
+    </w:r>
+    <w:proofErr w:type="gramStart"/>
+    <w:r>
+      <w:rPr>
+        <w:rFonts w:ascii="Arial" w:eastAsia="Arial" w:hAnsi="Arial"/>
+        <w:b/>
+        <w:sz w:val="19"/>
+      </w:rPr>
+      <w:t>NUMERO</w:t>
+    </w:r>
+    <w:proofErr w:type="gramEnd"/>
+    <w:r>
+      <w:rPr>
+        <w:rFonts w:ascii="Arial" w:eastAsia="Arial" w:hAnsi="Arial"/>
+        <w:b/>
+        <w:sz w:val="19"/>
+      </w:rPr>
+      <w:t>_CONTRATO}}</w:t>
     </w:r>
   </w:p>
   <w:p>

</xml_diff>

<commit_message>
Feature: suporte a CNPJ/PJ com representante legal na qualificação dos documentos.
Co-authored-by: Cursor <cursoragent@cursor.com>
</commit_message>
<xml_diff>
--- a/templates/ModeloContrato.docx
+++ b/templates/ModeloContrato.docx
@@ -29,7 +29,7 @@
           <w:rFonts w:ascii="Arial" w:eastAsia="Arial" w:hAnsi="Arial"/>
           <w:sz w:val="19"/>
         </w:rPr>
-        <w:t xml:space="preserve">O </w:t>
+        <w:t>{{TEXTO_QUALIFICACAO_CONTRATANTE}}, doravante designado(a) CONTRATANTE, {{TEXTO_VINCULO_ENDERECO_CONTRATANTE}}</w:t>
       </w:r>
       <w:proofErr w:type="spellStart"/>
       <w:r>
@@ -37,7 +37,7 @@
           <w:rFonts w:ascii="Arial" w:eastAsia="Arial" w:hAnsi="Arial"/>
           <w:sz w:val="19"/>
         </w:rPr>
-        <w:t>Sr</w:t>
+        <w:t/>
       </w:r>
       <w:proofErr w:type="spellEnd"/>
       <w:r>
@@ -45,7 +45,7 @@
           <w:rFonts w:ascii="Arial" w:eastAsia="Arial" w:hAnsi="Arial"/>
           <w:sz w:val="19"/>
         </w:rPr>
-        <w:t>(a). {{NOME_CLIENTE}}, doravante designado(a) CONTRATANTE, portador(a) do CPF nº {{CPF}}, RG nº {{RG_COMPLETO}}, residente e domiciliado em {{ENDERECO}}, Nº {{</w:t>
+        <w:t xml:space="preserve"> {{ENDERECO}}, Nº {{</w:t>
       </w:r>
       <w:proofErr w:type="gramStart"/>
       <w:r>

</xml_diff>

<commit_message>
Fix: aba Calculos prioriza dados tecnicos corrigidos e persiste overrides.
Co-authored-by: Cursor <cursoragent@cursor.com>
</commit_message>
<xml_diff>
--- a/templates/ModeloContrato.docx
+++ b/templates/ModeloContrato.docx
@@ -29,23 +29,23 @@
           <w:rFonts w:ascii="Arial" w:eastAsia="Arial" w:hAnsi="Arial"/>
           <w:sz w:val="19"/>
         </w:rPr>
-        <w:t>{{TEXTO_QUALIFICACAO_CONTRATANTE}}, doravante designado(a) CONTRATANTE, {{TEXTO_VINCULO_ENDERECO_CONTRATANTE}}</w:t>
-      </w:r>
-      <w:proofErr w:type="spellStart"/>
-      <w:r>
-        <w:rPr>
-          <w:rFonts w:ascii="Arial" w:eastAsia="Arial" w:hAnsi="Arial"/>
-          <w:sz w:val="19"/>
-        </w:rPr>
-        <w:t/>
-      </w:r>
-      <w:proofErr w:type="spellEnd"/>
-      <w:r>
-        <w:rPr>
-          <w:rFonts w:ascii="Arial" w:eastAsia="Arial" w:hAnsi="Arial"/>
-          <w:sz w:val="19"/>
-        </w:rPr>
-        <w:t xml:space="preserve"> {{ENDERECO}}, Nº {{</w:t>
+        <w:t>{{TEXTO_QUALIFICACAO_CONTRATANTE}}, doravante designado(a) CONTRATANTE, {{TEXTO_</w:t>
+      </w:r>
+      <w:proofErr w:type="gramStart"/>
+      <w:r>
+        <w:rPr>
+          <w:rFonts w:ascii="Arial" w:eastAsia="Arial" w:hAnsi="Arial"/>
+          <w:sz w:val="19"/>
+        </w:rPr>
+        <w:t>VINCULO</w:t>
+      </w:r>
+      <w:proofErr w:type="gramEnd"/>
+      <w:r>
+        <w:rPr>
+          <w:rFonts w:ascii="Arial" w:eastAsia="Arial" w:hAnsi="Arial"/>
+          <w:sz w:val="19"/>
+        </w:rPr>
+        <w:t>_ENDERECO_CONTRATANTE}} {{ENDERECO}}, Nº {{</w:t>
       </w:r>
       <w:proofErr w:type="gramStart"/>
       <w:r>
@@ -1067,6 +1067,7 @@
     </w:p>
     <w:p>
       <w:pPr>
+        <w:spacing w:before="0"/>
         <w:ind w:left="1027"/>
         <w:rPr>
           <w:rFonts w:ascii="Times New Roman" w:eastAsia="Times New Roman" w:hAnsi="Times New Roman" w:cs="Times New Roman"/>
@@ -1076,21 +1077,43 @@
         <w:rPr>
           <w:rFonts w:ascii="Times New Roman" w:eastAsia="Times New Roman" w:hAnsi="Times New Roman" w:cs="Times New Roman"/>
         </w:rPr>
-        <w:t>Banco: 290 - PagSeguro Internet Instituição de Pagamento S.A.</w:t>
+        <w:t xml:space="preserve">Banco: </w:t>
       </w:r>
       <w:r>
         <w:rPr>
           <w:rFonts w:ascii="Times New Roman" w:eastAsia="Times New Roman" w:hAnsi="Times New Roman" w:cs="Times New Roman"/>
         </w:rPr>
-        <w:br/>
+        <w:t>197 - Stone Pagamentos S.A.</w:t>
+      </w:r>
+    </w:p>
+    <w:p>
+      <w:pPr>
+        <w:spacing w:before="0"/>
+        <w:ind w:left="1027"/>
+        <w:rPr>
+          <w:rFonts w:ascii="Times New Roman" w:eastAsia="Times New Roman" w:hAnsi="Times New Roman" w:cs="Times New Roman"/>
+        </w:rPr>
+      </w:pPr>
+      <w:r>
+        <w:rPr>
+          <w:rFonts w:ascii="Times New Roman" w:eastAsia="Times New Roman" w:hAnsi="Times New Roman" w:cs="Times New Roman"/>
+        </w:rPr>
         <w:t>Agência: 0001</w:t>
       </w:r>
-      <w:r>
+    </w:p>
+    <w:p>
+      <w:pPr>
+        <w:spacing w:before="0"/>
+        <w:ind w:left="1027"/>
         <w:rPr>
           <w:rFonts w:ascii="Times New Roman" w:eastAsia="Times New Roman" w:hAnsi="Times New Roman" w:cs="Times New Roman"/>
         </w:rPr>
-        <w:br/>
-        <w:t>Número da conta: 55112299-7</w:t>
+      </w:pPr>
+      <w:r>
+        <w:rPr>
+          <w:rFonts w:ascii="Times New Roman" w:eastAsia="Times New Roman" w:hAnsi="Times New Roman" w:cs="Times New Roman"/>
+        </w:rPr>
+        <w:t>Conta: 365736305</w:t>
       </w:r>
       <w:r>
         <w:rPr>
@@ -1111,6 +1134,12 @@
           <w:rFonts w:ascii="Times New Roman" w:eastAsia="Times New Roman" w:hAnsi="Times New Roman" w:cs="Times New Roman"/>
         </w:rPr>
         <w:br/>
+      </w:r>
+      <w:r>
+        <w:rPr>
+          <w:rFonts w:ascii="Times New Roman" w:eastAsia="Times New Roman" w:hAnsi="Times New Roman" w:cs="Times New Roman"/>
+        </w:rPr>
+        <w:lastRenderedPageBreak/>
         <w:t>Nome: PIENG SOLUCOES ENERGETICAS LTDA</w:t>
       </w:r>
       <w:r>
@@ -1131,7 +1160,7 @@
         <w:rPr>
           <w:rFonts w:ascii="Times New Roman" w:eastAsia="Times New Roman" w:hAnsi="Times New Roman" w:cs="Times New Roman"/>
         </w:rPr>
-        <w:t xml:space="preserve"> 45.719.837/0001-23</w:t>
+        <w:t xml:space="preserve"> SOLARLASSIS002@GMAIL.COM</w:t>
       </w:r>
     </w:p>
     <w:p>

</xml_diff>